<commit_message>
Auto Daily 8:00 PM Dashboard Update [2026-10-12 20:00]
</commit_message>
<xml_diff>
--- a/docs/weekly/2026-W42_當週鐵人新知與文章整理.docx
+++ b/docs/weekly/2026-W42_當週鐵人新知與文章整理.docx
@@ -27,7 +27,7 @@
           <w:color w:val="555555"/>
           <w:sz w:val="19"/>
         </w:rPr>
-        <w:t>彙整時間：2026-10-12 09:00:20　｜　時間範圍：過去 7 天</w:t>
+        <w:t>彙整時間：2026-10-12 14:25:24　｜　時間範圍：過去 7 天</w:t>
         <w:br/>
         <w:t>來源網站：Slowtwitch, Triathlete, 220 Triathlon, TrainingPeaks, Joe Friel</w:t>
       </w:r>
@@ -638,53 +638,9 @@
           <w:color w:val="595959"/>
           <w:sz w:val="19"/>
         </w:rPr>
-        <w:t xml:space="preserve">【Slowtwitch | 2026-10-10】 </w:t>
+        <w:t xml:space="preserve">【Triathlete Magazine | 2026-10-09】 </w:t>
       </w:r>
       <w:hyperlink w:rId="rId24">
-        <w:r>
-          <w:rPr>
-            <w:color w:val="1F4D78"/>
-            <w:u w:val="single"/>
-            <w:b/>
-            <w:rFonts w:ascii="Calibri" w:hAnsi="Calibri" w:eastAsia="Microsoft JhengHei"/>
-            <w:sz w:val="22"/>
-          </w:rPr>
-          <w:t>Ben Kanute is All In For Kona. So is His Ride</w:t>
-        </w:r>
-      </w:hyperlink>
-    </w:p>
-    <w:p>
-      <w:pPr>
-        <w:spacing w:after="200"/>
-        <w:ind w:left="360"/>
-      </w:pPr>
-      <w:r>
-        <w:rPr>
-          <w:rFonts w:ascii="Calibri" w:hAnsi="Calibri" w:eastAsia="Microsoft JhengHei"/>
-          <w:b w:val="0"/>
-          <w:color w:val="444444"/>
-          <w:sz w:val="19"/>
-        </w:rPr>
-        <w:t>American Ben Kanute has left no stone unturned with his bike set up.</w:t>
-        <w:br/>
-        <w:t>The post Ben Kanute is All In For Kona. So is His Ride first appeared on Slowtwitch News.</w:t>
-      </w:r>
-    </w:p>
-    <w:p>
-      <w:pPr>
-        <w:keepNext/>
-        <w:spacing w:before="160" w:after="40"/>
-      </w:pPr>
-      <w:r>
-        <w:rPr>
-          <w:rFonts w:ascii="Calibri" w:hAnsi="Calibri" w:eastAsia="Microsoft JhengHei"/>
-          <w:b/>
-          <w:color w:val="595959"/>
-          <w:sz w:val="19"/>
-        </w:rPr>
-        <w:t xml:space="preserve">【Triathlete Magazine | 2026-10-09】 </w:t>
-      </w:r>
-      <w:hyperlink w:rId="rId25">
         <w:r>
           <w:rPr>
             <w:color w:val="1F4D78"/>
@@ -728,7 +684,7 @@
         </w:rPr>
         <w:t xml:space="preserve">【220 Triathlon | 2026-10-09】 </w:t>
       </w:r>
-      <w:hyperlink w:rId="rId26">
+      <w:hyperlink w:rId="rId25">
         <w:r>
           <w:rPr>
             <w:color w:val="1F4D78"/>
@@ -754,6 +710,48 @@
           <w:sz w:val="19"/>
         </w:rPr>
         <w:t>I test the SunGod Classics 4 Pro running sunglasses, designed with Courtney Dauwalter, to see how they perform when running.</w:t>
+      </w:r>
+    </w:p>
+    <w:p>
+      <w:pPr>
+        <w:keepNext/>
+        <w:spacing w:before="160" w:after="40"/>
+      </w:pPr>
+      <w:r>
+        <w:rPr>
+          <w:rFonts w:ascii="Calibri" w:hAnsi="Calibri" w:eastAsia="Microsoft JhengHei"/>
+          <w:b/>
+          <w:color w:val="595959"/>
+          <w:sz w:val="19"/>
+        </w:rPr>
+        <w:t xml:space="preserve">【220 Triathlon | 2026-10-08】 </w:t>
+      </w:r>
+      <w:hyperlink w:rId="rId26">
+        <w:r>
+          <w:rPr>
+            <w:color w:val="1F4D78"/>
+            <w:u w:val="single"/>
+            <w:b/>
+            <w:rFonts w:ascii="Calibri" w:hAnsi="Calibri" w:eastAsia="Microsoft JhengHei"/>
+            <w:sz w:val="22"/>
+          </w:rPr>
+          <w:t>Ultimate guide to approaching off-season without losing your fitness or drive</w:t>
+        </w:r>
+      </w:hyperlink>
+    </w:p>
+    <w:p>
+      <w:pPr>
+        <w:spacing w:after="200"/>
+        <w:ind w:left="360"/>
+      </w:pPr>
+      <w:r>
+        <w:rPr>
+          <w:rFonts w:ascii="Calibri" w:hAnsi="Calibri" w:eastAsia="Microsoft JhengHei"/>
+          <w:b w:val="0"/>
+          <w:color w:val="444444"/>
+          <w:sz w:val="19"/>
+        </w:rPr>
+        <w:t>A successful off-season means finding the right balance between recovery from racing and preparing for next year's events. Philip Hatzis explains how…</w:t>
       </w:r>
     </w:p>
     <w:p>
@@ -779,7 +777,7 @@
             <w:rFonts w:ascii="Calibri" w:hAnsi="Calibri" w:eastAsia="Microsoft JhengHei"/>
             <w:sz w:val="22"/>
           </w:rPr>
-          <w:t>Ultimate guide to approaching off-season without losing your fitness or drive</w:t>
+          <w:t>How to clean your cycling sunglasses without damaging them</w:t>
         </w:r>
       </w:hyperlink>
     </w:p>
@@ -795,7 +793,7 @@
           <w:color w:val="444444"/>
           <w:sz w:val="19"/>
         </w:rPr>
-        <w:t>A successful off-season means finding the right balance between recovery from racing and preparing for next year's events. Philip Hatzis explains how…</w:t>
+        <w:t>Even the finest glasses don’t clean themselves, yet there are many ways to keep your eyewear spotless. James Witts explains how to clean them properly to avoid disaster.</w:t>
       </w:r>
     </w:p>
     <w:p>
@@ -821,7 +819,7 @@
             <w:rFonts w:ascii="Calibri" w:hAnsi="Calibri" w:eastAsia="Microsoft JhengHei"/>
             <w:sz w:val="22"/>
           </w:rPr>
-          <w:t>How to clean your cycling sunglasses without damaging them</w:t>
+          <w:t>We tested 10 of the best triathlon running shoes in 2026 – which are the best for a speedy race transition?</w:t>
         </w:r>
       </w:hyperlink>
     </w:p>
@@ -837,7 +835,7 @@
           <w:color w:val="444444"/>
           <w:sz w:val="19"/>
         </w:rPr>
-        <w:t>Even the finest glasses don’t clean themselves, yet there are many ways to keep your eyewear spotless. James Witts explains how to clean them properly to avoid disaster.</w:t>
+        <w:t>To provide you with a triathlon boost, it’s wise to have some lightweight specific race-day shoes in your triathlon kit bag. We test and review 10 pairs of race-day run shoes.</w:t>
       </w:r>
     </w:p>
     <w:p>
@@ -852,7 +850,7 @@
           <w:color w:val="595959"/>
           <w:sz w:val="19"/>
         </w:rPr>
-        <w:t xml:space="preserve">【220 Triathlon | 2026-10-08】 </w:t>
+        <w:t xml:space="preserve">【220 Triathlon | 2026-10-07】 </w:t>
       </w:r>
       <w:hyperlink w:rId="rId29">
         <w:r>
@@ -863,7 +861,7 @@
             <w:rFonts w:ascii="Calibri" w:hAnsi="Calibri" w:eastAsia="Microsoft JhengHei"/>
             <w:sz w:val="22"/>
           </w:rPr>
-          <w:t>We tested 10 of the best triathlon running shoes in 2026 – which are the best for a speedy race transition?</w:t>
+          <w:t>Save £100 on one of the best-value turbo trainers we’ve tested</w:t>
         </w:r>
       </w:hyperlink>
     </w:p>
@@ -879,7 +877,7 @@
           <w:color w:val="444444"/>
           <w:sz w:val="19"/>
         </w:rPr>
-        <w:t>To provide you with a triathlon boost, it’s wise to have some lightweight specific race-day shoes in your triathlon kit bag. We test and review 10 pairs of race-day run shoes.</w:t>
+        <w:t>The Wahoo Kickr Core 2 is £100 off in the Amazon Prime Day deals, making one of our best-value turbo trainers even more affordable for winter indoor training.</w:t>
       </w:r>
     </w:p>
     <w:p>
@@ -905,7 +903,7 @@
             <w:rFonts w:ascii="Calibri" w:hAnsi="Calibri" w:eastAsia="Microsoft JhengHei"/>
             <w:sz w:val="22"/>
           </w:rPr>
-          <w:t>Save £100 on one of the best-value turbo trainers we’ve tested</w:t>
+          <w:t>What are the best running vests? Our run team tests favourite packs and vests for run adventures</w:t>
         </w:r>
       </w:hyperlink>
     </w:p>
@@ -921,7 +919,7 @@
           <w:color w:val="444444"/>
           <w:sz w:val="19"/>
         </w:rPr>
-        <w:t>The Wahoo Kickr Core 2 is £100 off in the Amazon Prime Day deals, making one of our best-value turbo trainers even more affordable for winter indoor training.</w:t>
+        <w:t>Hydration packs are a handy tool for long training runs, but are also essential for self-supported race days and adventures. So, which are the best running vests? Our experts put 8 to the test...</w:t>
       </w:r>
     </w:p>
     <w:p>
@@ -936,7 +934,7 @@
           <w:color w:val="595959"/>
           <w:sz w:val="19"/>
         </w:rPr>
-        <w:t xml:space="preserve">【220 Triathlon | 2026-10-07】 </w:t>
+        <w:t xml:space="preserve">【220 Triathlon | 2026-10-06】 </w:t>
       </w:r>
       <w:hyperlink w:rId="rId31">
         <w:r>
@@ -947,7 +945,7 @@
             <w:rFonts w:ascii="Calibri" w:hAnsi="Calibri" w:eastAsia="Microsoft JhengHei"/>
             <w:sz w:val="22"/>
           </w:rPr>
-          <w:t>What are the best running vests? Our run team tests favourite packs and vests for run adventures</w:t>
+          <w:t>What are the best sunglasses for running? We test our favourite 11 for clear vision and run comfort</w:t>
         </w:r>
       </w:hyperlink>
     </w:p>
@@ -963,7 +961,7 @@
           <w:color w:val="444444"/>
           <w:sz w:val="19"/>
         </w:rPr>
-        <w:t>Hydration packs are a handy tool for long training runs, but are also essential for self-supported race days and adventures. So, which are the best running vests? Our experts put 8 to the test...</w:t>
+        <w:t>A good pair of running sunnies can make runs in bright and sunny conditions a whole lot more enjoyable. Here are our favourite 11 pairs tested by our team of runners...</w:t>
       </w:r>
     </w:p>
     <w:p>
@@ -989,7 +987,7 @@
             <w:rFonts w:ascii="Calibri" w:hAnsi="Calibri" w:eastAsia="Microsoft JhengHei"/>
             <w:sz w:val="22"/>
           </w:rPr>
-          <w:t>What are the best sunglasses for running? We test our favourite 11 for clear vision and run comfort</w:t>
+          <w:t>“Energetic and bouncy”: Kiprun Kipride Max running shoe review</w:t>
         </w:r>
       </w:hyperlink>
     </w:p>
@@ -1005,7 +1003,7 @@
           <w:color w:val="444444"/>
           <w:sz w:val="19"/>
         </w:rPr>
-        <w:t>A good pair of running sunnies can make runs in bright and sunny conditions a whole lot more enjoyable. Here are our favourite 11 pairs tested by our team of runners...</w:t>
+        <w:t>Launched by Kiprun, Decathlon’s in-house running brand, in January 2026, we tested the Kiprun Kipride Max run shoes to see how they performed during different distance runs.</w:t>
       </w:r>
     </w:p>
     <w:p>
@@ -1031,7 +1029,7 @@
             <w:rFonts w:ascii="Calibri" w:hAnsi="Calibri" w:eastAsia="Microsoft JhengHei"/>
             <w:sz w:val="22"/>
           </w:rPr>
-          <w:t>“Energetic and bouncy”: Kiprun Kipride Max running shoe review</w:t>
+          <w:t>Voted our best running headphones – the Powerbeats Pro 2 are now 30% off in the Prime Day sale</w:t>
         </w:r>
       </w:hyperlink>
     </w:p>
@@ -1047,7 +1045,7 @@
           <w:color w:val="444444"/>
           <w:sz w:val="19"/>
         </w:rPr>
-        <w:t>Launched by Kiprun, Decathlon’s in-house running brand, in January 2026, we tested the Kiprun Kipride Max run shoes to see how they performed during different distance runs.</w:t>
+        <w:t>The Beats Powerbeats Pro 2 are our best-rated running headphones, and they're now almost 30% off in Amazon's Prime Day sale.</w:t>
       </w:r>
     </w:p>
     <w:p>
@@ -1073,7 +1071,7 @@
             <w:rFonts w:ascii="Calibri" w:hAnsi="Calibri" w:eastAsia="Microsoft JhengHei"/>
             <w:sz w:val="22"/>
           </w:rPr>
-          <w:t>Voted our best running headphones – the Powerbeats Pro 2 are now 30% off in the Prime Day sale</w:t>
+          <w:t>What are the best running shoes? We test 11 pairs from our favourite brands</w:t>
         </w:r>
       </w:hyperlink>
     </w:p>
@@ -1089,7 +1087,7 @@
           <w:color w:val="444444"/>
           <w:sz w:val="19"/>
         </w:rPr>
-        <w:t>The Beats Powerbeats Pro 2 are our best-rated running headphones, and they're now almost 30% off in Amazon's Prime Day sale.</w:t>
+        <w:t>Baffled by the search for running shoes and want to find the best pair for you? Here are our 11 favourite all-rounder running shoes, tested by experts who know their stuff.</w:t>
       </w:r>
     </w:p>
     <w:p>
@@ -1115,7 +1113,7 @@
             <w:rFonts w:ascii="Calibri" w:hAnsi="Calibri" w:eastAsia="Microsoft JhengHei"/>
             <w:sz w:val="22"/>
           </w:rPr>
-          <w:t>What are the best running shoes? We test 11 pairs from our favourite brands</w:t>
+          <w:t>What are the best running headphones? Here are our best-tested earbuds from the past year</w:t>
         </w:r>
       </w:hyperlink>
     </w:p>
@@ -1131,7 +1129,7 @@
           <w:color w:val="444444"/>
           <w:sz w:val="19"/>
         </w:rPr>
-        <w:t>Baffled by the search for running shoes and want to find the best pair for you? Here are our 11 favourite all-rounder running shoes, tested by experts who know their stuff.</w:t>
+        <w:t>Running to music is proven to offer a range of benefits to your training. Here, our experts put 9 sets of running earphones to the test</w:t>
       </w:r>
     </w:p>
     <w:p>
@@ -1157,48 +1155,6 @@
             <w:rFonts w:ascii="Calibri" w:hAnsi="Calibri" w:eastAsia="Microsoft JhengHei"/>
             <w:sz w:val="22"/>
           </w:rPr>
-          <w:t>What are the best running headphones? Here are our best-tested earbuds from the past year</w:t>
-        </w:r>
-      </w:hyperlink>
-    </w:p>
-    <w:p>
-      <w:pPr>
-        <w:spacing w:after="200"/>
-        <w:ind w:left="360"/>
-      </w:pPr>
-      <w:r>
-        <w:rPr>
-          <w:rFonts w:ascii="Calibri" w:hAnsi="Calibri" w:eastAsia="Microsoft JhengHei"/>
-          <w:b w:val="0"/>
-          <w:color w:val="444444"/>
-          <w:sz w:val="19"/>
-        </w:rPr>
-        <w:t>Running to music is proven to offer a range of benefits to your training. Here, our experts put 9 sets of running earphones to the test</w:t>
-      </w:r>
-    </w:p>
-    <w:p>
-      <w:pPr>
-        <w:keepNext/>
-        <w:spacing w:before="160" w:after="40"/>
-      </w:pPr>
-      <w:r>
-        <w:rPr>
-          <w:rFonts w:ascii="Calibri" w:hAnsi="Calibri" w:eastAsia="Microsoft JhengHei"/>
-          <w:b/>
-          <w:color w:val="595959"/>
-          <w:sz w:val="19"/>
-        </w:rPr>
-        <w:t xml:space="preserve">【220 Triathlon | 2026-10-06】 </w:t>
-      </w:r>
-      <w:hyperlink w:rId="rId37">
-        <w:r>
-          <w:rPr>
-            <w:color w:val="1F4D78"/>
-            <w:u w:val="single"/>
-            <w:b/>
-            <w:rFonts w:ascii="Calibri" w:hAnsi="Calibri" w:eastAsia="Microsoft JhengHei"/>
-            <w:sz w:val="22"/>
-          </w:rPr>
           <w:t>What are the best smartwatches for triathlon? We test the top 10 for multisport success</w:t>
         </w:r>
       </w:hyperlink>
@@ -1247,7 +1203,7 @@
         </w:rPr>
         <w:t xml:space="preserve">【Triathlete Magazine | 2026-10-11】 </w:t>
       </w:r>
-      <w:hyperlink w:rId="rId38">
+      <w:hyperlink w:rId="rId37">
         <w:r>
           <w:rPr>
             <w:color w:val="1F4D78"/>
@@ -1291,7 +1247,7 @@
         </w:rPr>
         <w:t xml:space="preserve">【Slowtwitch | 2026-10-11】 </w:t>
       </w:r>
-      <w:hyperlink w:rId="rId39">
+      <w:hyperlink w:rId="rId38">
         <w:r>
           <w:rPr>
             <w:color w:val="1F4D78"/>
@@ -1335,7 +1291,7 @@
         </w:rPr>
         <w:t xml:space="preserve">【220 Triathlon | 2026-10-05】 </w:t>
       </w:r>
-      <w:hyperlink w:rId="rId40">
+      <w:hyperlink w:rId="rId39">
         <w:r>
           <w:rPr>
             <w:color w:val="1F4D78"/>
@@ -1390,7 +1346,51 @@
           <w:color w:val="595959"/>
           <w:sz w:val="19"/>
         </w:rPr>
-        <w:t xml:space="preserve">【Triathlete Magazine | 2026-10-12】 </w:t>
+        <w:t xml:space="preserve">【Slowtwitch | 2026-10-12】 </w:t>
+      </w:r>
+      <w:hyperlink w:rId="rId40">
+        <w:r>
+          <w:rPr>
+            <w:color w:val="1F4D78"/>
+            <w:u w:val="single"/>
+            <w:b/>
+            <w:rFonts w:ascii="Calibri" w:hAnsi="Calibri" w:eastAsia="Microsoft JhengHei"/>
+            <w:sz w:val="22"/>
+          </w:rPr>
+          <w:t>Laura Philipp and Gustav Iden Use Kona Performances to Win 2026 IRONMAN Pro Series Titles</w:t>
+        </w:r>
+      </w:hyperlink>
+    </w:p>
+    <w:p>
+      <w:pPr>
+        <w:spacing w:after="200"/>
+        <w:ind w:left="360"/>
+      </w:pPr>
+      <w:r>
+        <w:rPr>
+          <w:rFonts w:ascii="Calibri" w:hAnsi="Calibri" w:eastAsia="Microsoft JhengHei"/>
+          <w:b w:val="0"/>
+          <w:color w:val="444444"/>
+          <w:sz w:val="19"/>
+        </w:rPr>
+        <w:t>IRONMAN World Champions Vincent Luis and Taylor Knibb were not the only beneficiaries of late race heroics on Saturday, as the 2026 IRONMAN Pro Series hung in the balance over...</w:t>
+        <w:br/>
+        <w:t>The post Laura Philip...</w:t>
+      </w:r>
+    </w:p>
+    <w:p>
+      <w:pPr>
+        <w:keepNext/>
+        <w:spacing w:before="160" w:after="40"/>
+      </w:pPr>
+      <w:r>
+        <w:rPr>
+          <w:rFonts w:ascii="Calibri" w:hAnsi="Calibri" w:eastAsia="Microsoft JhengHei"/>
+          <w:b/>
+          <w:color w:val="595959"/>
+          <w:sz w:val="19"/>
+        </w:rPr>
+        <w:t xml:space="preserve">【Slowtwitch | 2026-10-12】 </w:t>
       </w:r>
       <w:hyperlink w:rId="rId41">
         <w:r>
@@ -1401,7 +1401,7 @@
             <w:rFonts w:ascii="Calibri" w:hAnsi="Calibri" w:eastAsia="Microsoft JhengHei"/>
             <w:sz w:val="22"/>
           </w:rPr>
-          <w:t>Why the Ironman World Championship Remains Uncrackable</w:t>
+          <w:t>The Island Has Spoken – It Was Taylor’s Turn in Kona.</w:t>
         </w:r>
       </w:hyperlink>
     </w:p>
@@ -1417,9 +1417,9 @@
           <w:color w:val="444444"/>
           <w:sz w:val="19"/>
         </w:rPr>
-        <w:t>Despite decades of data, advanced nutrition, and precision pacing, Kona proves time and again that science is no match for Madame Pele.</w:t>
+        <w:t>The Top-5 Women Speak After Another Crazy Day in Kona.</w:t>
         <w:br/>
-        <w:t>Read the full article at Why the Ironman World Championship Rema...</w:t>
+        <w:t>The post The Island Has Spoken – It Was Taylor’s Turn in Kona. first appeared on Slowtwitch News.</w:t>
       </w:r>
     </w:p>
     <w:p>
@@ -1445,7 +1445,7 @@
             <w:rFonts w:ascii="Calibri" w:hAnsi="Calibri" w:eastAsia="Microsoft JhengHei"/>
             <w:sz w:val="22"/>
           </w:rPr>
-          <w:t>Your Ultimate Guide to the 2026 Ironman World Championship in Kona</w:t>
+          <w:t>Why the Ironman World Championship Remains Uncrackable</w:t>
         </w:r>
       </w:hyperlink>
     </w:p>
@@ -1461,9 +1461,9 @@
           <w:color w:val="444444"/>
           <w:sz w:val="19"/>
         </w:rPr>
-        <w:t>As men and women reunite on the Big Island for a single-day showdown on October 10, dive into race news, expert data analysis, and exclusive contender profiles.</w:t>
+        <w:t>Despite decades of data, advanced nutrition, and precision pacing, Kona proves time and again that science is no match for Madame Pele.</w:t>
         <w:br/>
-        <w:t>Read the full article at Your Ultimate ...</w:t>
+        <w:t>Read the full article at Why the Ironman World Championship Rema...</w:t>
       </w:r>
     </w:p>
     <w:p>
@@ -1489,6 +1489,50 @@
             <w:rFonts w:ascii="Calibri" w:hAnsi="Calibri" w:eastAsia="Microsoft JhengHei"/>
             <w:sz w:val="22"/>
           </w:rPr>
+          <w:t>Your Ultimate Guide to the 2026 Ironman World Championship in Kona</w:t>
+        </w:r>
+      </w:hyperlink>
+    </w:p>
+    <w:p>
+      <w:pPr>
+        <w:spacing w:after="200"/>
+        <w:ind w:left="360"/>
+      </w:pPr>
+      <w:r>
+        <w:rPr>
+          <w:rFonts w:ascii="Calibri" w:hAnsi="Calibri" w:eastAsia="Microsoft JhengHei"/>
+          <w:b w:val="0"/>
+          <w:color w:val="444444"/>
+          <w:sz w:val="19"/>
+        </w:rPr>
+        <w:t>As men and women reunite on the Big Island for a single-day showdown on October 10, dive into race news, expert data analysis, and exclusive contender profiles.</w:t>
+        <w:br/>
+        <w:t>Read the full article at Your Ultimate ...</w:t>
+      </w:r>
+    </w:p>
+    <w:p>
+      <w:pPr>
+        <w:keepNext/>
+        <w:spacing w:before="160" w:after="40"/>
+      </w:pPr>
+      <w:r>
+        <w:rPr>
+          <w:rFonts w:ascii="Calibri" w:hAnsi="Calibri" w:eastAsia="Microsoft JhengHei"/>
+          <w:b/>
+          <w:color w:val="595959"/>
+          <w:sz w:val="19"/>
+        </w:rPr>
+        <w:t xml:space="preserve">【Triathlete Magazine | 2026-10-12】 </w:t>
+      </w:r>
+      <w:hyperlink w:rId="rId44">
+        <w:r>
+          <w:rPr>
+            <w:color w:val="1F4D78"/>
+            <w:u w:val="single"/>
+            <w:b/>
+            <w:rFonts w:ascii="Calibri" w:hAnsi="Calibri" w:eastAsia="Microsoft JhengHei"/>
+            <w:sz w:val="22"/>
+          </w:rPr>
           <w:t>How Taylor Knibb’s Kona Win United the Endurance Community</w:t>
         </w:r>
       </w:hyperlink>
@@ -1524,7 +1568,7 @@
         </w:rPr>
         <w:t xml:space="preserve">【Slowtwitch | 2026-10-12】 </w:t>
       </w:r>
-      <w:hyperlink w:rId="rId44">
+      <w:hyperlink w:rId="rId45">
         <w:r>
           <w:rPr>
             <w:color w:val="1F4D78"/>
@@ -1568,7 +1612,7 @@
         </w:rPr>
         <w:t xml:space="preserve">【Triathlete Magazine | 2026-10-12】 </w:t>
       </w:r>
-      <w:hyperlink w:rId="rId45">
+      <w:hyperlink w:rId="rId46">
         <w:r>
           <w:rPr>
             <w:color w:val="1F4D78"/>
@@ -1596,50 +1640,6 @@
         <w:t>Triathlete photographer Brad Kaminski captured moments you likely didn't see on the race broadcast.</w:t>
         <w:br/>
         <w:t>Read the full article at What You Didnt See at the 2026 Ironman World Championship in Kona on Triath...</w:t>
-      </w:r>
-    </w:p>
-    <w:p>
-      <w:pPr>
-        <w:keepNext/>
-        <w:spacing w:before="160" w:after="40"/>
-      </w:pPr>
-      <w:r>
-        <w:rPr>
-          <w:rFonts w:ascii="Calibri" w:hAnsi="Calibri" w:eastAsia="Microsoft JhengHei"/>
-          <w:b/>
-          <w:color w:val="595959"/>
-          <w:sz w:val="19"/>
-        </w:rPr>
-        <w:t xml:space="preserve">【Triathlete Magazine | 2026-10-11】 </w:t>
-      </w:r>
-      <w:hyperlink w:rId="rId46">
-        <w:r>
-          <w:rPr>
-            <w:color w:val="1F4D78"/>
-            <w:u w:val="single"/>
-            <w:b/>
-            <w:rFonts w:ascii="Calibri" w:hAnsi="Calibri" w:eastAsia="Microsoft JhengHei"/>
-            <w:sz w:val="22"/>
-          </w:rPr>
-          <w:t>What Happens to Your Body After Racing the Ironman World Championship in Kona</w:t>
-        </w:r>
-      </w:hyperlink>
-    </w:p>
-    <w:p>
-      <w:pPr>
-        <w:spacing w:after="200"/>
-        <w:ind w:left="360"/>
-      </w:pPr>
-      <w:r>
-        <w:rPr>
-          <w:rFonts w:ascii="Calibri" w:hAnsi="Calibri" w:eastAsia="Microsoft JhengHei"/>
-          <w:b w:val="0"/>
-          <w:color w:val="444444"/>
-          <w:sz w:val="19"/>
-        </w:rPr>
-        <w:t>From muscle micro-tears and brain fog to gut distress, science explains why racing - or even watching - the Ironman World Championship in Hawaii leaves you utterly steamrolled for days.</w:t>
-        <w:br/>
-        <w:t>Read the full ...</w:t>
       </w:r>
     </w:p>
     <w:p>
@@ -1665,7 +1665,7 @@
             <w:rFonts w:ascii="Calibri" w:hAnsi="Calibri" w:eastAsia="Microsoft JhengHei"/>
             <w:sz w:val="22"/>
           </w:rPr>
-          <w:t>Imogen Simmonds on Fifth Place at Kona 2026: “It’s Been So Worth It”</w:t>
+          <w:t>What Happens to Your Body After Racing the Ironman World Championship in Kona</w:t>
         </w:r>
       </w:hyperlink>
     </w:p>
@@ -1681,7 +1681,9 @@
           <w:color w:val="444444"/>
           <w:sz w:val="19"/>
         </w:rPr>
-        <w:t>Imogen Simmonds had a steady day on her way to placing fifth overall at the 2026 Ironman World Championship. Here's what she had to say about her race in Kona, which she said was "so beyond my expecta...</w:t>
+        <w:t>From muscle micro-tears and brain fog to gut distress, science explains why racing - or even watching - the Ironman World Championship in Hawaii leaves you utterly steamrolled for days.</w:t>
+        <w:br/>
+        <w:t>Read the full ...</w:t>
       </w:r>
     </w:p>
     <w:p>
@@ -1707,7 +1709,7 @@
             <w:rFonts w:ascii="Calibri" w:hAnsi="Calibri" w:eastAsia="Microsoft JhengHei"/>
             <w:sz w:val="22"/>
           </w:rPr>
-          <w:t>Vincent Luis Is Done After Winning the 2026 Ironman World Championship</w:t>
+          <w:t>Imogen Simmonds on Fifth Place at Kona 2026: “It’s Been So Worth It”</w:t>
         </w:r>
       </w:hyperlink>
     </w:p>
@@ -1723,9 +1725,7 @@
           <w:color w:val="444444"/>
           <w:sz w:val="19"/>
         </w:rPr>
-        <w:t>The Frenchman went to some dark places in training to win the 2026 Ironman World Championship in his debut (and final) race.</w:t>
-        <w:br/>
-        <w:t>Read the full article at Vincent Luis Is Done After Winning the 2026 Ironma...</w:t>
+        <w:t>Imogen Simmonds had a steady day on her way to placing fifth overall at the 2026 Ironman World Championship. Here's what she had to say about her race in Kona, which she said was "so beyond my expecta...</w:t>
       </w:r>
     </w:p>
     <w:p>
@@ -1751,6 +1751,50 @@
             <w:rFonts w:ascii="Calibri" w:hAnsi="Calibri" w:eastAsia="Microsoft JhengHei"/>
             <w:sz w:val="22"/>
           </w:rPr>
+          <w:t>Vincent Luis Is Done After Winning the 2026 Ironman World Championship</w:t>
+        </w:r>
+      </w:hyperlink>
+    </w:p>
+    <w:p>
+      <w:pPr>
+        <w:spacing w:after="200"/>
+        <w:ind w:left="360"/>
+      </w:pPr>
+      <w:r>
+        <w:rPr>
+          <w:rFonts w:ascii="Calibri" w:hAnsi="Calibri" w:eastAsia="Microsoft JhengHei"/>
+          <w:b w:val="0"/>
+          <w:color w:val="444444"/>
+          <w:sz w:val="19"/>
+        </w:rPr>
+        <w:t>The Frenchman went to some dark places in training to win the 2026 Ironman World Championship in his debut (and final) race.</w:t>
+        <w:br/>
+        <w:t>Read the full article at Vincent Luis Is Done After Winning the 2026 Ironma...</w:t>
+      </w:r>
+    </w:p>
+    <w:p>
+      <w:pPr>
+        <w:keepNext/>
+        <w:spacing w:before="160" w:after="40"/>
+      </w:pPr>
+      <w:r>
+        <w:rPr>
+          <w:rFonts w:ascii="Calibri" w:hAnsi="Calibri" w:eastAsia="Microsoft JhengHei"/>
+          <w:b/>
+          <w:color w:val="595959"/>
+          <w:sz w:val="19"/>
+        </w:rPr>
+        <w:t xml:space="preserve">【Triathlete Magazine | 2026-10-11】 </w:t>
+      </w:r>
+      <w:hyperlink w:rId="rId50">
+        <w:r>
+          <w:rPr>
+            <w:color w:val="1F4D78"/>
+            <w:u w:val="single"/>
+            <w:b/>
+            <w:rFonts w:ascii="Calibri" w:hAnsi="Calibri" w:eastAsia="Microsoft JhengHei"/>
+            <w:sz w:val="22"/>
+          </w:rPr>
           <w:t>Taylor Knibb’s (Big) Thoughts on Winning the 2026 Ironman World Championship</w:t>
         </w:r>
       </w:hyperlink>
@@ -1786,7 +1830,7 @@
         </w:rPr>
         <w:t xml:space="preserve">【220 Triathlon | 2026-10-11】 </w:t>
       </w:r>
-      <w:hyperlink w:rId="rId50">
+      <w:hyperlink w:rId="rId51">
         <w:r>
           <w:rPr>
             <w:color w:val="1F4D78"/>
@@ -1828,7 +1872,7 @@
         </w:rPr>
         <w:t xml:space="preserve">【Slowtwitch | 2026-10-11】 </w:t>
       </w:r>
-      <w:hyperlink w:rId="rId51">
+      <w:hyperlink w:rId="rId52">
         <w:r>
           <w:rPr>
             <w:color w:val="1F4D78"/>
@@ -1872,7 +1916,7 @@
         </w:rPr>
         <w:t xml:space="preserve">【220 Triathlon | 2026-10-11】 </w:t>
       </w:r>
-      <w:hyperlink w:rId="rId52">
+      <w:hyperlink w:rId="rId53">
         <w:r>
           <w:rPr>
             <w:color w:val="1F4D78"/>
@@ -1914,7 +1958,7 @@
         </w:rPr>
         <w:t xml:space="preserve">【Slowtwitch | 2026-10-11】 </w:t>
       </w:r>
-      <w:hyperlink w:rId="rId53">
+      <w:hyperlink w:rId="rId54">
         <w:r>
           <w:rPr>
             <w:color w:val="1F4D78"/>
@@ -1958,7 +2002,7 @@
         </w:rPr>
         <w:t xml:space="preserve">【220 Triathlon | 2026-10-11】 </w:t>
       </w:r>
-      <w:hyperlink w:rId="rId54">
+      <w:hyperlink w:rId="rId55">
         <w:r>
           <w:rPr>
             <w:color w:val="1F4D78"/>
@@ -2000,7 +2044,7 @@
         </w:rPr>
         <w:t xml:space="preserve">【Triathlete Magazine | 2026-10-11】 </w:t>
       </w:r>
-      <w:hyperlink w:rId="rId55">
+      <w:hyperlink w:rId="rId56">
         <w:r>
           <w:rPr>
             <w:color w:val="1F4D78"/>
@@ -2042,7 +2086,7 @@
         </w:rPr>
         <w:t xml:space="preserve">【220 Triathlon | 2026-10-10】 </w:t>
       </w:r>
-      <w:hyperlink w:rId="rId56">
+      <w:hyperlink w:rId="rId57">
         <w:r>
           <w:rPr>
             <w:color w:val="1F4D78"/>
@@ -2068,50 +2112,6 @@
           <w:sz w:val="19"/>
         </w:rPr>
         <w:t>Gordon Ramsay has shared a message of support to athletes taking part in the Ironman World Championships today in Kona. The celebrity chef and long-time triathlete has competed before and included pho...</w:t>
-      </w:r>
-    </w:p>
-    <w:p>
-      <w:pPr>
-        <w:keepNext/>
-        <w:spacing w:before="160" w:after="40"/>
-      </w:pPr>
-      <w:r>
-        <w:rPr>
-          <w:rFonts w:ascii="Calibri" w:hAnsi="Calibri" w:eastAsia="Microsoft JhengHei"/>
-          <w:b/>
-          <w:color w:val="595959"/>
-          <w:sz w:val="19"/>
-        </w:rPr>
-        <w:t xml:space="preserve">【Triathlete Magazine | 2026-10-10】 </w:t>
-      </w:r>
-      <w:hyperlink w:rId="rId57">
-        <w:r>
-          <w:rPr>
-            <w:color w:val="1F4D78"/>
-            <w:u w:val="single"/>
-            <w:b/>
-            <w:rFonts w:ascii="Calibri" w:hAnsi="Calibri" w:eastAsia="Microsoft JhengHei"/>
-            <w:sz w:val="22"/>
-          </w:rPr>
-          <w:t>One Man’s 14-Year-Old Trek Madone is His Perfect World Championship Ride</w:t>
-        </w:r>
-      </w:hyperlink>
-    </w:p>
-    <w:p>
-      <w:pPr>
-        <w:spacing w:after="200"/>
-        <w:ind w:left="360"/>
-      </w:pPr>
-      <w:r>
-        <w:rPr>
-          <w:rFonts w:ascii="Calibri" w:hAnsi="Calibri" w:eastAsia="Microsoft JhengHei"/>
-          <w:b w:val="0"/>
-          <w:color w:val="444444"/>
-          <w:sz w:val="19"/>
-        </w:rPr>
-        <w:t>Aaron Fleming’s journey from teenage tragedy to the Ironman World Championship is best viewed through the lens of his nearly ancient Trek.</w:t>
-        <w:br/>
-        <w:t>Read the full article at One Man’s 14-Year-Old Trek Madone is...</w:t>
       </w:r>
     </w:p>
     <w:p>
@@ -2137,6 +2137,50 @@
             <w:rFonts w:ascii="Calibri" w:hAnsi="Calibri" w:eastAsia="Microsoft JhengHei"/>
             <w:sz w:val="22"/>
           </w:rPr>
+          <w:t>One Man’s 14-Year-Old Trek Madone is His Perfect World Championship Ride</w:t>
+        </w:r>
+      </w:hyperlink>
+    </w:p>
+    <w:p>
+      <w:pPr>
+        <w:spacing w:after="200"/>
+        <w:ind w:left="360"/>
+      </w:pPr>
+      <w:r>
+        <w:rPr>
+          <w:rFonts w:ascii="Calibri" w:hAnsi="Calibri" w:eastAsia="Microsoft JhengHei"/>
+          <w:b w:val="0"/>
+          <w:color w:val="444444"/>
+          <w:sz w:val="19"/>
+        </w:rPr>
+        <w:t>Aaron Fleming’s journey from teenage tragedy to the Ironman World Championship is best viewed through the lens of his nearly ancient Trek.</w:t>
+        <w:br/>
+        <w:t>Read the full article at One Man’s 14-Year-Old Trek Madone is...</w:t>
+      </w:r>
+    </w:p>
+    <w:p>
+      <w:pPr>
+        <w:keepNext/>
+        <w:spacing w:before="160" w:after="40"/>
+      </w:pPr>
+      <w:r>
+        <w:rPr>
+          <w:rFonts w:ascii="Calibri" w:hAnsi="Calibri" w:eastAsia="Microsoft JhengHei"/>
+          <w:b/>
+          <w:color w:val="595959"/>
+          <w:sz w:val="19"/>
+        </w:rPr>
+        <w:t xml:space="preserve">【Triathlete Magazine | 2026-10-10】 </w:t>
+      </w:r>
+      <w:hyperlink w:rId="rId59">
+        <w:r>
+          <w:rPr>
+            <w:color w:val="1F4D78"/>
+            <w:u w:val="single"/>
+            <w:b/>
+            <w:rFonts w:ascii="Calibri" w:hAnsi="Calibri" w:eastAsia="Microsoft JhengHei"/>
+            <w:sz w:val="22"/>
+          </w:rPr>
           <w:t>The Expedition Cruise Line That Takes Guests Way Beyond the Viewing Deck</w:t>
         </w:r>
       </w:hyperlink>
@@ -2172,7 +2216,7 @@
         </w:rPr>
         <w:t xml:space="preserve">【Slowtwitch | 2026-10-10】 </w:t>
       </w:r>
-      <w:hyperlink w:rId="rId59">
+      <w:hyperlink w:rId="rId60">
         <w:r>
           <w:rPr>
             <w:color w:val="1F4D78"/>
@@ -2216,7 +2260,7 @@
         </w:rPr>
         <w:t xml:space="preserve">【Triathlete Magazine | 2026-10-10】 </w:t>
       </w:r>
-      <w:hyperlink w:rId="rId60">
+      <w:hyperlink w:rId="rId61">
         <w:r>
           <w:rPr>
             <w:color w:val="1F4D78"/>
@@ -2260,7 +2304,7 @@
         </w:rPr>
         <w:t xml:space="preserve">【220 Triathlon | 2026-10-09】 </w:t>
       </w:r>
-      <w:hyperlink w:rId="rId61">
+      <w:hyperlink w:rId="rId62">
         <w:r>
           <w:rPr>
             <w:color w:val="1F4D78"/>
@@ -2286,48 +2330,6 @@
           <w:sz w:val="19"/>
         </w:rPr>
         <w:t>The 2026 Ironman World Championships head to Kailua-Kona, Hawaii, on 10 October. Here’s how to watch all the race action unfold live.</w:t>
-      </w:r>
-    </w:p>
-    <w:p>
-      <w:pPr>
-        <w:keepNext/>
-        <w:spacing w:before="160" w:after="40"/>
-      </w:pPr>
-      <w:r>
-        <w:rPr>
-          <w:rFonts w:ascii="Calibri" w:hAnsi="Calibri" w:eastAsia="Microsoft JhengHei"/>
-          <w:b/>
-          <w:color w:val="595959"/>
-          <w:sz w:val="19"/>
-        </w:rPr>
-        <w:t xml:space="preserve">【Slowtwitch | 2026-10-09】 </w:t>
-      </w:r>
-      <w:hyperlink w:rId="rId62">
-        <w:r>
-          <w:rPr>
-            <w:color w:val="1F4D78"/>
-            <w:u w:val="single"/>
-            <w:b/>
-            <w:rFonts w:ascii="Calibri" w:hAnsi="Calibri" w:eastAsia="Microsoft JhengHei"/>
-            <w:sz w:val="22"/>
-          </w:rPr>
-          <w:t>IRONMAN World Championship Press Conference Takeaways</w:t>
-        </w:r>
-      </w:hyperlink>
-    </w:p>
-    <w:p>
-      <w:pPr>
-        <w:spacing w:after="200"/>
-        <w:ind w:left="360"/>
-      </w:pPr>
-      <w:r>
-        <w:rPr>
-          <w:rFonts w:ascii="Calibri" w:hAnsi="Calibri" w:eastAsia="Microsoft JhengHei"/>
-          <w:b w:val="0"/>
-          <w:color w:val="444444"/>
-          <w:sz w:val="19"/>
-        </w:rPr>
-        <w:t>From Taylor Knibb's prescient description of what makes the Big Island so special, to Kristian Blummenfelt's stark honesty of what it would mean to earn another IRONMAN world title - this time in Hawa...</w:t>
       </w:r>
     </w:p>
     <w:p>

</xml_diff>